<commit_message>
Update lab2 and lab3
</commit_message>
<xml_diff>
--- a/lab_2/questions_34_2.docx
+++ b/lab_2/questions_34_2.docx
@@ -145,7 +145,21 @@
           <w:rStyle w:val="SubtleEmphasis"/>
           <w:lang w:val="fr-CA"/>
         </w:rPr>
-        <w:t>Question 1:</w:t>
+        <w:t xml:space="preserve">Question </w:t>
+      </w:r>
+      <w:r>
+        <w:rPr>
+          <w:rStyle w:val="SubtleEmphasis"/>
+          <w:lang w:val="fr-CA"/>
+        </w:rPr>
+        <w:t>1</w:t>
+      </w:r>
+      <w:r>
+        <w:rPr>
+          <w:rStyle w:val="SubtleEmphasis"/>
+          <w:lang w:val="fr-CA"/>
+        </w:rPr>
+        <w:t>:</w:t>
       </w:r>
       <w:r>
         <w:rPr>
@@ -159,23 +173,7 @@
           <w:rStyle w:val="SubtleEmphasis"/>
           <w:lang w:val="fr-CA"/>
         </w:rPr>
-        <w:t xml:space="preserve">Qu’elle est la composition d’un substrat de base sur un </w:t>
-      </w:r>
-      <w:proofErr w:type="spellStart"/>
-      <w:r>
-        <w:rPr>
-          <w:rStyle w:val="SubtleEmphasis"/>
-          <w:lang w:val="fr-CA"/>
-        </w:rPr>
-        <w:t>PCBs</w:t>
-      </w:r>
-      <w:proofErr w:type="spellEnd"/>
-      <w:r>
-        <w:rPr>
-          <w:rStyle w:val="SubtleEmphasis"/>
-          <w:lang w:val="fr-CA"/>
-        </w:rPr>
-        <w:t>? Est-ce un isolant ou un conducteur?</w:t>
+        <w:t>Dans vos mots, à quoi sert la tresse de cuivre?</w:t>
       </w:r>
     </w:p>
     <w:p>
@@ -285,7 +283,21 @@
           <w:rStyle w:val="SubtleEmphasis"/>
           <w:lang w:val="fr-CA"/>
         </w:rPr>
-        <w:t>Question 2:</w:t>
+        <w:t xml:space="preserve">Question </w:t>
+      </w:r>
+      <w:r>
+        <w:rPr>
+          <w:rStyle w:val="SubtleEmphasis"/>
+          <w:lang w:val="fr-CA"/>
+        </w:rPr>
+        <w:t>2</w:t>
+      </w:r>
+      <w:r>
+        <w:rPr>
+          <w:rStyle w:val="SubtleEmphasis"/>
+          <w:lang w:val="fr-CA"/>
+        </w:rPr>
+        <w:t>:</w:t>
       </w:r>
       <w:r>
         <w:rPr>
@@ -299,7 +311,7 @@
           <w:rStyle w:val="SubtleEmphasis"/>
           <w:lang w:val="fr-CA"/>
         </w:rPr>
-        <w:t>Dans vos mots, à quoi sert la tresse de cuivre?</w:t>
+        <w:t>Sur un PCB, s’il y a une ‘Bobine’, qu’elle est la lettre utilisée?</w:t>
       </w:r>
     </w:p>
     <w:p>
@@ -387,134 +399,66 @@
           <w:lang w:val="fr-CA"/>
         </w:rPr>
       </w:pPr>
-      <w:r>
-        <w:rPr>
-          <w:rStyle w:val="SubtleEmphasis"/>
-          <w:i w:val="0"/>
-          <w:iCs w:val="0"/>
-          <w:lang w:val="fr-CA"/>
-        </w:rPr>
-        <w:t>.</w:t>
-      </w:r>
-    </w:p>
-    <w:p>
-      <w:pPr>
-        <w:rPr>
-          <w:rStyle w:val="SubtleEmphasis"/>
-          <w:lang w:val="fr-CA"/>
-        </w:rPr>
-      </w:pPr>
-      <w:r>
-        <w:rPr>
-          <w:rStyle w:val="SubtleEmphasis"/>
-          <w:lang w:val="fr-CA"/>
-        </w:rPr>
-        <w:t xml:space="preserve">Question </w:t>
-      </w:r>
-      <w:r>
-        <w:rPr>
-          <w:rStyle w:val="SubtleEmphasis"/>
-          <w:lang w:val="fr-CA"/>
-        </w:rPr>
-        <w:t>3</w:t>
-      </w:r>
-      <w:r>
-        <w:rPr>
-          <w:rStyle w:val="SubtleEmphasis"/>
-          <w:lang w:val="fr-CA"/>
-        </w:rPr>
-        <w:t>:</w:t>
-      </w:r>
-      <w:r>
-        <w:rPr>
-          <w:rStyle w:val="SubtleEmphasis"/>
-          <w:lang w:val="fr-CA"/>
-        </w:rPr>
-        <w:t xml:space="preserve"> </w:t>
-      </w:r>
-      <w:r>
-        <w:rPr>
-          <w:rStyle w:val="SubtleEmphasis"/>
-          <w:lang w:val="fr-CA"/>
-        </w:rPr>
-        <w:t>Sur un PCB, s’il y a une ‘Bobine’, qu’elle est la lettre utilisée?</w:t>
-      </w:r>
-    </w:p>
-    <w:p>
-      <w:pPr>
-        <w:rPr>
-          <w:rStyle w:val="SubtleEmphasis"/>
-          <w:i w:val="0"/>
-          <w:iCs w:val="0"/>
-          <w:lang w:val="fr-CA"/>
-        </w:rPr>
-      </w:pPr>
-      <w:r>
-        <w:rPr>
-          <w:rStyle w:val="SubtleEmphasis"/>
-          <w:i w:val="0"/>
-          <w:iCs w:val="0"/>
-          <w:lang w:val="fr-CA"/>
-        </w:rPr>
-        <w:t>.</w:t>
-      </w:r>
-    </w:p>
-    <w:p>
-      <w:pPr>
-        <w:rPr>
-          <w:rStyle w:val="SubtleEmphasis"/>
-          <w:i w:val="0"/>
-          <w:iCs w:val="0"/>
-          <w:lang w:val="fr-CA"/>
-        </w:rPr>
-      </w:pPr>
-      <w:r>
-        <w:rPr>
-          <w:rStyle w:val="SubtleEmphasis"/>
-          <w:i w:val="0"/>
-          <w:iCs w:val="0"/>
-          <w:lang w:val="fr-CA"/>
-        </w:rPr>
-        <w:t>.</w:t>
-      </w:r>
-    </w:p>
-    <w:p>
-      <w:pPr>
-        <w:rPr>
-          <w:rStyle w:val="SubtleEmphasis"/>
-          <w:i w:val="0"/>
-          <w:iCs w:val="0"/>
-          <w:lang w:val="fr-CA"/>
-        </w:rPr>
-      </w:pPr>
-      <w:r>
-        <w:rPr>
-          <w:rStyle w:val="SubtleEmphasis"/>
-          <w:i w:val="0"/>
-          <w:iCs w:val="0"/>
-          <w:lang w:val="fr-CA"/>
-        </w:rPr>
-        <w:t>.</w:t>
-      </w:r>
-    </w:p>
-    <w:p>
-      <w:pPr>
-        <w:rPr>
-          <w:rStyle w:val="SubtleEmphasis"/>
-          <w:i w:val="0"/>
-          <w:iCs w:val="0"/>
-          <w:lang w:val="fr-CA"/>
-        </w:rPr>
-      </w:pPr>
-      <w:r>
-        <w:rPr>
-          <w:rStyle w:val="SubtleEmphasis"/>
-          <w:i w:val="0"/>
-          <w:iCs w:val="0"/>
-          <w:lang w:val="fr-CA"/>
-        </w:rPr>
-        <w:t>.</w:t>
-      </w:r>
+    </w:p>
+    <w:p>
+      <w:pPr>
+        <w:rPr>
+          <w:rStyle w:val="SubtleEmphasis"/>
+          <w:i w:val="0"/>
+          <w:iCs w:val="0"/>
+          <w:lang w:val="fr-CA"/>
+        </w:rPr>
+      </w:pPr>
+    </w:p>
+    <w:p>
+      <w:pPr>
+        <w:rPr>
+          <w:rStyle w:val="SubtleEmphasis"/>
+          <w:i w:val="0"/>
+          <w:iCs w:val="0"/>
+          <w:lang w:val="fr-CA"/>
+        </w:rPr>
+      </w:pPr>
+    </w:p>
+    <w:p>
+      <w:pPr>
+        <w:rPr>
+          <w:rStyle w:val="SubtleEmphasis"/>
+          <w:i w:val="0"/>
+          <w:iCs w:val="0"/>
+          <w:lang w:val="fr-CA"/>
+        </w:rPr>
+      </w:pPr>
+    </w:p>
+    <w:p>
+      <w:pPr>
+        <w:rPr>
+          <w:rStyle w:val="SubtleEmphasis"/>
+          <w:i w:val="0"/>
+          <w:iCs w:val="0"/>
+          <w:lang w:val="fr-CA"/>
+        </w:rPr>
+      </w:pPr>
+    </w:p>
+    <w:p>
+      <w:pPr>
+        <w:rPr>
+          <w:rStyle w:val="SubtleEmphasis"/>
+          <w:i w:val="0"/>
+          <w:iCs w:val="0"/>
+          <w:lang w:val="fr-CA"/>
+        </w:rPr>
+      </w:pPr>
+    </w:p>
+    <w:p>
+      <w:pPr>
+        <w:rPr>
+          <w:rStyle w:val="SubtleEmphasis"/>
+          <w:i w:val="0"/>
+          <w:iCs w:val="0"/>
+          <w:lang w:val="fr-CA"/>
+        </w:rPr>
+      </w:pPr>
     </w:p>
     <w:p>
       <w:pPr>

</xml_diff>